<commit_message>
1231 nga landa prarparake
</commit_message>
<xml_diff>
--- a/1231-Zaskok-Latifja/3-Mbështjellësi-i-lëndës-1231-Zaskok-Latifja.docx
+++ b/1231-Zaskok-Latifja/3-Mbështjellësi-i-lëndës-1231-Zaskok-Latifja.docx
@@ -419,7 +419,27 @@
                           <w:szCs w:val="30"/>
                           <w:u w:val="single"/>
                         </w:rPr>
-                        <w:t>241/2026</w:t>
+                        <w:t>24</w:t>
+                      </w:r>
+                      <w:r>
+                        <w:rPr>
+                          <w:rFonts w:ascii="Times New Roman" w:hAnsi="Times New Roman" w:cs="Times New Roman"/>
+                          <w:b/>
+                          <w:sz w:val="30"/>
+                          <w:szCs w:val="30"/>
+                          <w:u w:val="single"/>
+                        </w:rPr>
+                        <w:t>0</w:t>
+                      </w:r>
+                      <w:r>
+                        <w:rPr>
+                          <w:rFonts w:ascii="Times New Roman" w:hAnsi="Times New Roman" w:cs="Times New Roman"/>
+                          <w:b/>
+                          <w:sz w:val="30"/>
+                          <w:szCs w:val="30"/>
+                          <w:u w:val="single"/>
+                        </w:rPr>
+                        <w:t>/2026</w:t>
                       </w:r>
                     </w:p>
                   </w:txbxContent>
@@ -899,7 +919,15 @@
                       <w:sz w:val="28"/>
                       <w:szCs w:val="28"/>
                     </w:rPr>
-                    <w:t>Numri i licencës</w:t>
+                    <w:t xml:space="preserve">Numri </w:t>
+                  </w:r>
+                  <w:r>
+                    <w:rPr>
+                      <w:rFonts w:ascii="Times New Roman" w:hAnsi="Times New Roman" w:cs="Times New Roman"/>
+                      <w:sz w:val="28"/>
+                      <w:szCs w:val="28"/>
+                    </w:rPr>
+                    <w:t>i licencës</w:t>
                   </w:r>
                   <w:r>
                     <w:rPr>
@@ -1038,9 +1066,9 @@
       <w:r>
         <w:rPr>
           <w:rFonts w:ascii="MS Gothic" w:eastAsia="MS Gothic" w:hAnsi="MS Gothic" w:cs="MS Gothic" w:hint="eastAsia"/>
-          <w:color w:val="FF0000"/>
-        </w:rPr>
-        <w:t>☒</w:t>
+          <w:color w:val="000000"/>
+        </w:rPr>
+        <w:t>☐</w:t>
       </w:r>
       <w:r>
         <w:t xml:space="preserve"> </w:t>

</xml_diff>